<commit_message>
TS 3.4 Jatai Ghanam final
</commit_message>
<xml_diff>
--- a/TS Jatai Ghanam Project/TS 3.4/TS 3.4 Ghanam Tamil Corrections.docx
+++ b/TS Jatai Ghanam Project/TS 3.4/TS 3.4 Ghanam Tamil Corrections.docx
@@ -1,6 +1,6 @@
 
 <file path=word/document.xml><?xml version="1.0" encoding="utf-8"?>
-<w:document xmlns:wpc="http://schemas.microsoft.com/office/word/2010/wordprocessingCanvas" xmlns:cx="http://schemas.microsoft.com/office/drawing/2014/chartex" xmlns:cx1="http://schemas.microsoft.com/office/drawing/2015/9/8/chartex" xmlns:cx2="http://schemas.microsoft.com/office/drawing/2015/10/21/chartex" xmlns:cx3="http://schemas.microsoft.com/office/drawing/2016/5/9/chartex" xmlns:cx4="http://schemas.microsoft.com/office/drawing/2016/5/10/chartex" xmlns:cx5="http://schemas.microsoft.com/office/drawing/2016/5/11/chartex" xmlns:cx6="http://schemas.microsoft.com/office/drawing/2016/5/12/chartex" xmlns:cx7="http://schemas.microsoft.com/office/drawing/2016/5/13/chartex" xmlns:cx8="http://schemas.microsoft.com/office/drawing/2016/5/14/chartex" xmlns:mc="http://schemas.openxmlformats.org/markup-compatibility/2006" xmlns:aink="http://schemas.microsoft.com/office/drawing/2016/ink" xmlns:am3d="http://schemas.microsoft.com/office/drawing/2017/model3d" xmlns:o="urn:schemas-microsoft-com:office:office" xmlns:oel="http://schemas.microsoft.com/office/2019/extlst" xmlns:r="http://schemas.openxmlformats.org/officeDocument/2006/relationships" xmlns:m="http://schemas.openxmlformats.org/officeDocument/2006/math" xmlns:v="urn:schemas-microsoft-com:vml" xmlns:wp14="http://schemas.microsoft.com/office/word/2010/wordprocessingDrawing" xmlns:wp="http://schemas.openxmlformats.org/drawingml/2006/wordprocessingDrawing" xmlns:w10="urn:schemas-microsoft-com:office:word" xmlns:w="http://schemas.openxmlformats.org/wordprocessingml/2006/main" xmlns:w14="http://schemas.microsoft.com/office/word/2010/wordml" xmlns:w15="http://schemas.microsoft.com/office/word/2012/wordml" xmlns:w16cei="http://schemas.microsoft.com/office/word/2026/wordml/cei" xmlns:w16cex="http://schemas.microsoft.com/office/word/2018/wordml/cex" xmlns:w16cid="http://schemas.microsoft.com/office/word/2016/wordml/cid" xmlns:w16="http://schemas.microsoft.com/office/word/2018/wordml" xmlns:w16du="http://schemas.microsoft.com/office/word/2023/wordml/word16du" xmlns:w16sdtdh="http://schemas.microsoft.com/office/word/2020/wordml/sdtdatahash" xmlns:w16sdtfl="http://schemas.microsoft.com/office/word/2024/wordml/sdtformatlock" xmlns:w16se="http://schemas.microsoft.com/office/word/2015/wordml/symex" xmlns:wpg="http://schemas.microsoft.com/office/word/2010/wordprocessingGroup" xmlns:wpi="http://schemas.microsoft.com/office/word/2010/wordprocessingInk" xmlns:wne="http://schemas.microsoft.com/office/word/2006/wordml" xmlns:wps="http://schemas.microsoft.com/office/word/2010/wordprocessingShape" mc:Ignorable="w14 w15 w16se w16cid w16 w16cex w16sdtdh w16sdtfl w16du wp14">
+<w:document xmlns:wpc="http://schemas.microsoft.com/office/word/2010/wordprocessingCanvas" xmlns:cx="http://schemas.microsoft.com/office/drawing/2014/chartex" xmlns:cx1="http://schemas.microsoft.com/office/drawing/2015/9/8/chartex" xmlns:cx2="http://schemas.microsoft.com/office/drawing/2015/10/21/chartex" xmlns:cx3="http://schemas.microsoft.com/office/drawing/2016/5/9/chartex" xmlns:cx4="http://schemas.microsoft.com/office/drawing/2016/5/10/chartex" xmlns:cx5="http://schemas.microsoft.com/office/drawing/2016/5/11/chartex" xmlns:cx6="http://schemas.microsoft.com/office/drawing/2016/5/12/chartex" xmlns:cx7="http://schemas.microsoft.com/office/drawing/2016/5/13/chartex" xmlns:cx8="http://schemas.microsoft.com/office/drawing/2016/5/14/chartex" xmlns:mc="http://schemas.openxmlformats.org/markup-compatibility/2006" xmlns:aink="http://schemas.microsoft.com/office/drawing/2016/ink" xmlns:am3d="http://schemas.microsoft.com/office/drawing/2017/model3d" xmlns:o="urn:schemas-microsoft-com:office:office" xmlns:oel="http://schemas.microsoft.com/office/2019/extlst" xmlns:r="http://schemas.openxmlformats.org/officeDocument/2006/relationships" xmlns:m="http://schemas.openxmlformats.org/officeDocument/2006/math" xmlns:v="urn:schemas-microsoft-com:vml" xmlns:wp14="http://schemas.microsoft.com/office/word/2010/wordprocessingDrawing" xmlns:wp="http://schemas.openxmlformats.org/drawingml/2006/wordprocessingDrawing" xmlns:w10="urn:schemas-microsoft-com:office:word" xmlns:w="http://schemas.openxmlformats.org/wordprocessingml/2006/main" xmlns:w14="http://schemas.microsoft.com/office/word/2010/wordml" xmlns:w15="http://schemas.microsoft.com/office/word/2012/wordml" xmlns:w16cex="http://schemas.microsoft.com/office/word/2018/wordml/cex" xmlns:w16cid="http://schemas.microsoft.com/office/word/2016/wordml/cid" xmlns:w16="http://schemas.microsoft.com/office/word/2018/wordml" xmlns:w16du="http://schemas.microsoft.com/office/word/2023/wordml/word16du" xmlns:w16sdtdh="http://schemas.microsoft.com/office/word/2020/wordml/sdtdatahash" xmlns:w16sdtfl="http://schemas.microsoft.com/office/word/2024/wordml/sdtformatlock" xmlns:w16se="http://schemas.microsoft.com/office/word/2015/wordml/symex" xmlns:wpg="http://schemas.microsoft.com/office/word/2010/wordprocessingGroup" xmlns:wpi="http://schemas.microsoft.com/office/word/2010/wordprocessingInk" xmlns:wne="http://schemas.microsoft.com/office/word/2006/wordml" xmlns:wps="http://schemas.microsoft.com/office/word/2010/wordprocessingShape" mc:Ignorable="w14 w15 w16se w16cid w16 w16cex w16sdtdh w16sdtfl w16du wp14">
   <w:body>
     <w:p>
       <w:pPr>
@@ -102,9 +102,8 @@
           <w:szCs w:val="32"/>
           <w:u w:val="single"/>
         </w:rPr>
-        <w:t xml:space="preserve">Observed </w:t>
+        <w:t xml:space="preserve">Observed till </w:t>
       </w:r>
-      <w:proofErr w:type="gramStart"/>
       <w:r>
         <w:rPr>
           <w:b/>
@@ -113,20 +112,8 @@
           <w:szCs w:val="32"/>
           <w:u w:val="single"/>
         </w:rPr>
-        <w:t xml:space="preserve">till </w:t>
+        <w:t>31st Aug 2026</w:t>
       </w:r>
-      <w:r>
-        <w:rPr>
-          <w:b/>
-          <w:bCs/>
-          <w:sz w:val="32"/>
-          <w:szCs w:val="32"/>
-          <w:highlight w:val="red"/>
-          <w:u w:val="single"/>
-        </w:rPr>
-        <w:t>?????</w:t>
-      </w:r>
-      <w:proofErr w:type="gramEnd"/>
     </w:p>
     <w:p>
       <w:pPr>
@@ -445,6 +432,14 @@
             </w:r>
             <w:r>
               <w:rPr>
+                <w:rFonts w:ascii="BRH Malayalam Extra" w:hAnsi="BRH Malayalam Extra" w:cs="BRH Devanagari Extra"/>
+                <w:color w:val="000000"/>
+                <w:szCs w:val="32"/>
+              </w:rPr>
+              <w:t>–</w:t>
+            </w:r>
+            <w:r>
+              <w:rPr>
                 <w:rFonts w:ascii="BRH Tamil Tab Extra" w:hAnsi="BRH Tamil Tab Extra" w:cs="Latha"/>
                 <w:b/>
                 <w:bCs/>
@@ -1123,6 +1118,14 @@
             </w:r>
             <w:r>
               <w:rPr>
+                <w:rFonts w:ascii="BRH Malayalam Extra" w:hAnsi="BRH Malayalam Extra" w:cs="BRH Devanagari Extra"/>
+                <w:color w:val="000000"/>
+                <w:szCs w:val="32"/>
+              </w:rPr>
+              <w:t>–</w:t>
+            </w:r>
+            <w:r>
+              <w:rPr>
                 <w:rFonts w:ascii="Latha" w:hAnsi="Latha" w:cs="Latha"/>
                 <w:szCs w:val="24"/>
                 <w:cs/>
@@ -1785,6 +1788,14 @@
             </w:r>
             <w:r>
               <w:rPr>
+                <w:rFonts w:ascii="BRH Malayalam Extra" w:hAnsi="BRH Malayalam Extra" w:cs="BRH Devanagari Extra"/>
+                <w:color w:val="000000"/>
+                <w:szCs w:val="32"/>
+              </w:rPr>
+              <w:t>–</w:t>
+            </w:r>
+            <w:r>
+              <w:rPr>
                 <w:rFonts w:ascii="BRH Tamil Tab Extra" w:hAnsi="BRH Tamil Tab Extra" w:cs="Latha"/>
                 <w:b/>
                 <w:bCs/>
@@ -2471,6 +2482,14 @@
             </w:r>
             <w:r>
               <w:rPr>
+                <w:rFonts w:ascii="BRH Malayalam Extra" w:hAnsi="BRH Malayalam Extra" w:cs="BRH Devanagari Extra"/>
+                <w:color w:val="000000"/>
+                <w:szCs w:val="32"/>
+              </w:rPr>
+              <w:t>–</w:t>
+            </w:r>
+            <w:r>
+              <w:rPr>
                 <w:rFonts w:ascii="BRH Tamil Tab Extra" w:hAnsi="BRH Tamil Tab Extra" w:cs="Latha"/>
                 <w:b/>
                 <w:bCs/>
@@ -3128,31 +3147,39 @@
               <w:adjustRightInd w:val="0"/>
               <w:spacing w:before="0" w:line="240" w:lineRule="auto"/>
               <w:rPr>
-                <w:rFonts w:cs="ar"/>
+                <w:rFonts w:ascii="Latha" w:hAnsi="Latha" w:cs="Latha"/>
+                <w:szCs w:val="24"/>
+                <w:lang w:bidi="ta-IN"/>
+              </w:rPr>
+            </w:pPr>
+            <w:r>
+              <w:rPr>
+                <w:rFonts w:ascii="Latha" w:hAnsi="Latha" w:cs="Latha"/>
+                <w:szCs w:val="24"/>
+                <w:highlight w:val="yellow"/>
+                <w:cs/>
+                <w:lang w:bidi="ta-IN"/>
+              </w:rPr>
+              <w:t>ஶ்ர</w:t>
+            </w:r>
+            <w:r>
+              <w:rPr>
+                <w:rFonts w:ascii="BRH Tamil Tab Extra" w:hAnsi="BRH Tamil Tab Extra" w:cs="Latha"/>
+                <w:b/>
+                <w:bCs/>
+                <w:szCs w:val="28"/>
+                <w:highlight w:val="yellow"/>
+                <w:lang w:bidi="ta-IN"/>
+              </w:rPr>
+              <w:t>…</w:t>
+            </w:r>
+            <w:r>
+              <w:rPr>
+                <w:rFonts w:ascii="BRH Malayalam Extra" w:hAnsi="BRH Malayalam Extra" w:cs="BRH Devanagari Extra"/>
                 <w:color w:val="000000"/>
-                <w:szCs w:val="36"/>
-              </w:rPr>
-            </w:pPr>
-            <w:r>
-              <w:rPr>
-                <w:rFonts w:ascii="Latha" w:hAnsi="Latha" w:cs="Latha"/>
-                <w:szCs w:val="24"/>
-                <w:highlight w:val="yellow"/>
-                <w:cs/>
-                <w:lang w:bidi="ta-IN"/>
-              </w:rPr>
-              <w:t>ஶ்ர</w:t>
-            </w:r>
-            <w:r>
-              <w:rPr>
-                <w:rFonts w:ascii="BRH Tamil Tab Extra" w:hAnsi="BRH Tamil Tab Extra" w:cs="Latha"/>
-                <w:b/>
-                <w:bCs/>
-                <w:szCs w:val="28"/>
-                <w:highlight w:val="yellow"/>
-                <w:lang w:bidi="ta-IN"/>
-              </w:rPr>
-              <w:t>…</w:t>
+                <w:szCs w:val="32"/>
+              </w:rPr>
+              <w:t>–</w:t>
             </w:r>
             <w:r>
               <w:rPr>
@@ -3303,190 +3330,6 @@
                 <w:lang w:bidi="ta-IN"/>
               </w:rPr>
               <w:t xml:space="preserve">| </w:t>
-            </w:r>
-          </w:p>
-        </w:tc>
-        <w:tc>
-          <w:tcPr>
-            <w:tcW w:w="7371" w:type="dxa"/>
-          </w:tcPr>
-          <w:p>
-            <w:pPr>
-              <w:autoSpaceDE w:val="0"/>
-              <w:autoSpaceDN w:val="0"/>
-              <w:adjustRightInd w:val="0"/>
-              <w:spacing w:before="0" w:line="240" w:lineRule="auto"/>
-              <w:rPr>
-                <w:rFonts w:ascii="Latha" w:hAnsi="Latha" w:cs="Latha"/>
-                <w:szCs w:val="24"/>
-                <w:lang w:bidi="ta-IN"/>
-              </w:rPr>
-            </w:pPr>
-            <w:r>
-              <w:rPr>
-                <w:rFonts w:ascii="Latha" w:hAnsi="Latha" w:cs="Latha"/>
-                <w:b/>
-                <w:bCs/>
-                <w:szCs w:val="24"/>
-                <w:cs/>
-                <w:lang w:bidi="ta-IN"/>
-              </w:rPr>
-              <w:t>34</w:t>
-            </w:r>
-            <w:r>
-              <w:rPr>
-                <w:rFonts w:ascii="Latha" w:hAnsi="Latha" w:cs="Latha"/>
-                <w:b/>
-                <w:bCs/>
-                <w:szCs w:val="24"/>
-                <w:cs/>
-                <w:lang w:bidi="ta-IN"/>
-              </w:rPr>
-              <w:t>)</w:t>
-            </w:r>
-            <w:r>
-              <w:rPr>
-                <w:rFonts w:ascii="Latha" w:hAnsi="Latha" w:cs="Latha"/>
-                <w:szCs w:val="24"/>
-                <w:lang w:bidi="ta-IN"/>
-              </w:rPr>
-              <w:tab/>
-            </w:r>
-            <w:r>
-              <w:rPr>
-                <w:rFonts w:ascii="Latha" w:hAnsi="Latha" w:cs="Latha"/>
-                <w:b/>
-                <w:bCs/>
-                <w:szCs w:val="24"/>
-                <w:cs/>
-                <w:lang w:bidi="ta-IN"/>
-              </w:rPr>
-              <w:t>3.4.11</w:t>
-            </w:r>
-            <w:r>
-              <w:rPr>
-                <w:rFonts w:ascii="Latha" w:hAnsi="Latha" w:cs="Latha"/>
-                <w:b/>
-                <w:bCs/>
-                <w:szCs w:val="24"/>
-                <w:lang w:bidi="ta-IN"/>
-              </w:rPr>
-              <w:t>.</w:t>
-            </w:r>
-            <w:r>
-              <w:rPr>
-                <w:rFonts w:ascii="Latha" w:hAnsi="Latha" w:cs="Latha"/>
-                <w:b/>
-                <w:bCs/>
-                <w:szCs w:val="24"/>
-                <w:cs/>
-                <w:lang w:bidi="ta-IN"/>
-              </w:rPr>
-              <w:t>1</w:t>
-            </w:r>
-            <w:r>
-              <w:rPr>
-                <w:rFonts w:ascii="Latha" w:hAnsi="Latha" w:cs="Latha"/>
-                <w:b/>
-                <w:bCs/>
-                <w:szCs w:val="24"/>
-                <w:lang w:bidi="ta-IN"/>
-              </w:rPr>
-              <w:t>(2</w:t>
-            </w:r>
-            <w:r>
-              <w:rPr>
-                <w:rFonts w:ascii="Latha" w:hAnsi="Latha" w:cs="Latha"/>
-                <w:b/>
-                <w:bCs/>
-                <w:szCs w:val="24"/>
-                <w:cs/>
-                <w:lang w:bidi="ta-IN"/>
-              </w:rPr>
-              <w:t>7</w:t>
-            </w:r>
-            <w:r>
-              <w:rPr>
-                <w:rFonts w:ascii="Latha" w:hAnsi="Latha" w:cs="Latha"/>
-                <w:b/>
-                <w:bCs/>
-                <w:szCs w:val="24"/>
-                <w:lang w:bidi="ta-IN"/>
-              </w:rPr>
-              <w:t>)</w:t>
-            </w:r>
-            <w:r>
-              <w:rPr>
-                <w:rFonts w:ascii="Latha" w:hAnsi="Latha" w:cs="Latha"/>
-                <w:szCs w:val="24"/>
-                <w:lang w:bidi="ta-IN"/>
-              </w:rPr>
-              <w:t xml:space="preserve">-  </w:t>
-            </w:r>
-            <w:r>
-              <w:rPr>
-                <w:rFonts w:ascii="Latha" w:hAnsi="Latha" w:cs="Latha"/>
-                <w:szCs w:val="24"/>
-                <w:cs/>
-                <w:lang w:bidi="ta-IN"/>
-              </w:rPr>
-              <w:t>ஶ்ரவா</w:t>
-            </w:r>
-            <w:r>
-              <w:rPr>
-                <w:rFonts w:ascii="Latha" w:hAnsi="Latha" w:cs="Latha"/>
-                <w:b/>
-                <w:bCs/>
-                <w:szCs w:val="24"/>
-                <w:lang w:bidi="ta-IN"/>
-              </w:rPr>
-              <w:t>(</w:t>
-            </w:r>
-            <w:r>
-              <w:rPr>
-                <w:rFonts w:ascii="Latha" w:hAnsi="Latha" w:cs="Latha"/>
-                <w:szCs w:val="24"/>
-                <w:cs/>
-                <w:lang w:bidi="ta-IN"/>
-              </w:rPr>
-              <w:t>க்ம்</w:t>
-            </w:r>
-            <w:r>
-              <w:rPr>
-                <w:rFonts w:ascii="Latha" w:hAnsi="Latha" w:cs="Latha"/>
-                <w:b/>
-                <w:bCs/>
-                <w:szCs w:val="24"/>
-                <w:lang w:bidi="ta-IN"/>
-              </w:rPr>
-              <w:t>)</w:t>
-            </w:r>
-            <w:r>
-              <w:rPr>
-                <w:rFonts w:ascii="BRH Tamil Tab Extra" w:hAnsi="BRH Tamil Tab Extra" w:cs="Latha"/>
-                <w:b/>
-                <w:bCs/>
-                <w:szCs w:val="28"/>
-                <w:lang w:bidi="ta-IN"/>
-              </w:rPr>
-              <w:t>†</w:t>
-            </w:r>
-            <w:r>
-              <w:rPr>
-                <w:rFonts w:ascii="Latha" w:hAnsi="Latha" w:cs="Latha"/>
-                <w:szCs w:val="24"/>
-                <w:cs/>
-                <w:lang w:bidi="ta-IN"/>
-              </w:rPr>
-              <w:t xml:space="preserve">ஸி </w:t>
-            </w:r>
-            <w:r>
-              <w:rPr>
-                <w:rFonts w:ascii="Latha" w:hAnsi="Latha" w:cs="Latha"/>
-                <w:szCs w:val="24"/>
-                <w:lang w:bidi="ta-IN"/>
-              </w:rPr>
-              <w:t>||</w:t>
             </w:r>
           </w:p>
           <w:p>
@@ -3499,192 +3342,6 @@
                 <w:rFonts w:cs="ar"/>
                 <w:color w:val="000000"/>
                 <w:szCs w:val="36"/>
-              </w:rPr>
-            </w:pPr>
-            <w:r>
-              <w:rPr>
-                <w:rFonts w:ascii="Latha" w:hAnsi="Latha" w:cs="Latha"/>
-                <w:szCs w:val="24"/>
-                <w:highlight w:val="green"/>
-                <w:cs/>
-                <w:lang w:bidi="ta-IN"/>
-              </w:rPr>
-              <w:t>ஶ்ர</w:t>
-            </w:r>
-            <w:r>
-              <w:rPr>
-                <w:rFonts w:ascii="Latha" w:hAnsi="Latha" w:cs="Latha"/>
-                <w:szCs w:val="24"/>
-                <w:cs/>
-                <w:lang w:bidi="ta-IN"/>
-              </w:rPr>
-              <w:t>வா</w:t>
-            </w:r>
-            <w:r>
-              <w:rPr>
-                <w:rFonts w:ascii="BRH Tamil Tab Extra" w:hAnsi="BRH Tamil Tab Extra" w:cs="Latha"/>
-                <w:b/>
-                <w:bCs/>
-                <w:szCs w:val="28"/>
-                <w:lang w:bidi="ta-IN"/>
-              </w:rPr>
-              <w:t>…</w:t>
-            </w:r>
-            <w:r>
-              <w:rPr>
-                <w:rFonts w:ascii="Latha" w:hAnsi="Latha" w:cs="Latha"/>
-                <w:b/>
-                <w:bCs/>
-                <w:szCs w:val="24"/>
-                <w:lang w:bidi="ta-IN"/>
-              </w:rPr>
-              <w:t>(</w:t>
-            </w:r>
-            <w:r>
-              <w:rPr>
-                <w:rFonts w:ascii="Latha" w:hAnsi="Latha" w:cs="Latha"/>
-                <w:szCs w:val="24"/>
-                <w:cs/>
-                <w:lang w:bidi="ta-IN"/>
-              </w:rPr>
-              <w:t>க்ம்</w:t>
-            </w:r>
-            <w:r>
-              <w:rPr>
-                <w:rFonts w:ascii="Latha" w:hAnsi="Latha" w:cs="Latha"/>
-                <w:b/>
-                <w:bCs/>
-                <w:szCs w:val="24"/>
-                <w:lang w:bidi="ta-IN"/>
-              </w:rPr>
-              <w:t>)</w:t>
-            </w:r>
-            <w:r>
-              <w:rPr>
-                <w:rFonts w:ascii="BRH Tamil Tab Extra" w:hAnsi="BRH Tamil Tab Extra" w:cs="Latha"/>
-                <w:b/>
-                <w:bCs/>
-                <w:szCs w:val="28"/>
-                <w:lang w:bidi="ta-IN"/>
-              </w:rPr>
-              <w:t>…</w:t>
-            </w:r>
-            <w:r>
-              <w:rPr>
-                <w:rFonts w:ascii="Latha" w:hAnsi="Latha" w:cs="Latha"/>
-                <w:szCs w:val="24"/>
-                <w:cs/>
-                <w:lang w:bidi="ta-IN"/>
-              </w:rPr>
-              <w:t>ஸீதி</w:t>
-            </w:r>
-            <w:r>
-              <w:rPr>
-                <w:rFonts w:ascii="BRH Tamil Tab Extra" w:hAnsi="BRH Tamil Tab Extra" w:cs="Latha"/>
-                <w:b/>
-                <w:bCs/>
-                <w:szCs w:val="28"/>
-                <w:lang w:bidi="ta-IN"/>
-              </w:rPr>
-              <w:t>…</w:t>
-            </w:r>
-            <w:r>
-              <w:rPr>
-                <w:rFonts w:ascii="Latha" w:hAnsi="Latha" w:cs="Latha"/>
-                <w:szCs w:val="24"/>
-                <w:lang w:bidi="ta-IN"/>
-              </w:rPr>
-              <w:t xml:space="preserve"> </w:t>
-            </w:r>
-            <w:r>
-              <w:rPr>
-                <w:rFonts w:ascii="Latha" w:hAnsi="Latha" w:cs="Latha"/>
-                <w:szCs w:val="24"/>
-                <w:cs/>
-                <w:lang w:bidi="ta-IN"/>
-              </w:rPr>
-              <w:t>ஶ்ரவா</w:t>
-            </w:r>
-            <w:r>
-              <w:rPr>
-                <w:rFonts w:ascii="Latha" w:hAnsi="Latha" w:cs="Latha"/>
-                <w:b/>
-                <w:bCs/>
-                <w:szCs w:val="24"/>
-                <w:lang w:bidi="ta-IN"/>
-              </w:rPr>
-              <w:t>(</w:t>
-            </w:r>
-            <w:r>
-              <w:rPr>
-                <w:rFonts w:ascii="Latha" w:hAnsi="Latha" w:cs="Latha"/>
-                <w:szCs w:val="24"/>
-                <w:cs/>
-                <w:lang w:bidi="ta-IN"/>
-              </w:rPr>
-              <w:t>க்ம்</w:t>
-            </w:r>
-            <w:r>
-              <w:rPr>
-                <w:rFonts w:ascii="Latha" w:hAnsi="Latha" w:cs="Latha"/>
-                <w:b/>
-                <w:bCs/>
-                <w:szCs w:val="24"/>
-                <w:lang w:bidi="ta-IN"/>
-              </w:rPr>
-              <w:t>)</w:t>
-            </w:r>
-            <w:r>
-              <w:rPr>
-                <w:rFonts w:ascii="BRH Tamil Tab Extra" w:hAnsi="BRH Tamil Tab Extra" w:cs="Latha"/>
-                <w:b/>
-                <w:bCs/>
-                <w:szCs w:val="28"/>
-                <w:lang w:bidi="ta-IN"/>
-              </w:rPr>
-              <w:t>†</w:t>
-            </w:r>
-            <w:r>
-              <w:rPr>
-                <w:rFonts w:ascii="Latha" w:hAnsi="Latha" w:cs="Latha"/>
-                <w:szCs w:val="24"/>
-                <w:cs/>
-                <w:lang w:bidi="ta-IN"/>
-              </w:rPr>
-              <w:t xml:space="preserve">ஸி </w:t>
-            </w:r>
-            <w:r>
-              <w:rPr>
-                <w:rFonts w:ascii="Latha" w:hAnsi="Latha" w:cs="Latha"/>
-                <w:szCs w:val="24"/>
-                <w:lang w:bidi="ta-IN"/>
-              </w:rPr>
-              <w:t xml:space="preserve">| </w:t>
-            </w:r>
-          </w:p>
-        </w:tc>
-      </w:tr>
-      <w:tr>
-        <w:trPr>
-          <w:trHeight w:val="978"/>
-        </w:trPr>
-        <w:tc>
-          <w:tcPr>
-            <w:tcW w:w="7166" w:type="dxa"/>
-          </w:tcPr>
-          <w:p>
-            <w:pPr>
-              <w:autoSpaceDE w:val="0"/>
-              <w:autoSpaceDN w:val="0"/>
-              <w:adjustRightInd w:val="0"/>
-              <w:spacing w:before="0" w:line="240" w:lineRule="auto"/>
-              <w:rPr>
-                <w:rFonts w:ascii="Latha" w:hAnsi="Latha" w:cs="Latha"/>
-                <w:b/>
-                <w:bCs/>
-                <w:szCs w:val="24"/>
-                <w:cs/>
-                <w:lang w:bidi="ta-IN"/>
               </w:rPr>
             </w:pPr>
           </w:p>
@@ -3701,17 +3358,462 @@
               <w:spacing w:before="0" w:line="240" w:lineRule="auto"/>
               <w:rPr>
                 <w:rFonts w:ascii="Latha" w:hAnsi="Latha" w:cs="Latha"/>
-                <w:b/>
-                <w:bCs/>
-                <w:szCs w:val="24"/>
-                <w:cs/>
+                <w:szCs w:val="24"/>
                 <w:lang w:bidi="ta-IN"/>
               </w:rPr>
             </w:pPr>
+            <w:r>
+              <w:rPr>
+                <w:rFonts w:ascii="Latha" w:hAnsi="Latha" w:cs="Latha"/>
+                <w:b/>
+                <w:bCs/>
+                <w:szCs w:val="24"/>
+                <w:cs/>
+                <w:lang w:bidi="ta-IN"/>
+              </w:rPr>
+              <w:t>34</w:t>
+            </w:r>
+            <w:r>
+              <w:rPr>
+                <w:rFonts w:ascii="Latha" w:hAnsi="Latha" w:cs="Latha"/>
+                <w:b/>
+                <w:bCs/>
+                <w:szCs w:val="24"/>
+                <w:cs/>
+                <w:lang w:bidi="ta-IN"/>
+              </w:rPr>
+              <w:t>)</w:t>
+            </w:r>
+            <w:r>
+              <w:rPr>
+                <w:rFonts w:ascii="Latha" w:hAnsi="Latha" w:cs="Latha"/>
+                <w:szCs w:val="24"/>
+                <w:lang w:bidi="ta-IN"/>
+              </w:rPr>
+              <w:tab/>
+            </w:r>
+            <w:r>
+              <w:rPr>
+                <w:rFonts w:ascii="Latha" w:hAnsi="Latha" w:cs="Latha"/>
+                <w:b/>
+                <w:bCs/>
+                <w:szCs w:val="24"/>
+                <w:cs/>
+                <w:lang w:bidi="ta-IN"/>
+              </w:rPr>
+              <w:t>3.4.11</w:t>
+            </w:r>
+            <w:r>
+              <w:rPr>
+                <w:rFonts w:ascii="Latha" w:hAnsi="Latha" w:cs="Latha"/>
+                <w:b/>
+                <w:bCs/>
+                <w:szCs w:val="24"/>
+                <w:lang w:bidi="ta-IN"/>
+              </w:rPr>
+              <w:t>.</w:t>
+            </w:r>
+            <w:r>
+              <w:rPr>
+                <w:rFonts w:ascii="Latha" w:hAnsi="Latha" w:cs="Latha"/>
+                <w:b/>
+                <w:bCs/>
+                <w:szCs w:val="24"/>
+                <w:cs/>
+                <w:lang w:bidi="ta-IN"/>
+              </w:rPr>
+              <w:t>1</w:t>
+            </w:r>
+            <w:r>
+              <w:rPr>
+                <w:rFonts w:ascii="Latha" w:hAnsi="Latha" w:cs="Latha"/>
+                <w:b/>
+                <w:bCs/>
+                <w:szCs w:val="24"/>
+                <w:lang w:bidi="ta-IN"/>
+              </w:rPr>
+              <w:t>(2</w:t>
+            </w:r>
+            <w:r>
+              <w:rPr>
+                <w:rFonts w:ascii="Latha" w:hAnsi="Latha" w:cs="Latha"/>
+                <w:b/>
+                <w:bCs/>
+                <w:szCs w:val="24"/>
+                <w:cs/>
+                <w:lang w:bidi="ta-IN"/>
+              </w:rPr>
+              <w:t>7</w:t>
+            </w:r>
+            <w:r>
+              <w:rPr>
+                <w:rFonts w:ascii="Latha" w:hAnsi="Latha" w:cs="Latha"/>
+                <w:b/>
+                <w:bCs/>
+                <w:szCs w:val="24"/>
+                <w:lang w:bidi="ta-IN"/>
+              </w:rPr>
+              <w:t>)</w:t>
+            </w:r>
+            <w:r>
+              <w:rPr>
+                <w:rFonts w:ascii="Latha" w:hAnsi="Latha" w:cs="Latha"/>
+                <w:szCs w:val="24"/>
+                <w:lang w:bidi="ta-IN"/>
+              </w:rPr>
+              <w:t xml:space="preserve">-  </w:t>
+            </w:r>
+            <w:r>
+              <w:rPr>
+                <w:rFonts w:ascii="Latha" w:hAnsi="Latha" w:cs="Latha"/>
+                <w:szCs w:val="24"/>
+                <w:cs/>
+                <w:lang w:bidi="ta-IN"/>
+              </w:rPr>
+              <w:t>ஶ்ரவா</w:t>
+            </w:r>
+            <w:r>
+              <w:rPr>
+                <w:rFonts w:ascii="Latha" w:hAnsi="Latha" w:cs="Latha"/>
+                <w:b/>
+                <w:bCs/>
+                <w:szCs w:val="24"/>
+                <w:lang w:bidi="ta-IN"/>
+              </w:rPr>
+              <w:t>(</w:t>
+            </w:r>
+            <w:r>
+              <w:rPr>
+                <w:rFonts w:ascii="Latha" w:hAnsi="Latha" w:cs="Latha"/>
+                <w:szCs w:val="24"/>
+                <w:cs/>
+                <w:lang w:bidi="ta-IN"/>
+              </w:rPr>
+              <w:t>க்ம்</w:t>
+            </w:r>
+            <w:r>
+              <w:rPr>
+                <w:rFonts w:ascii="Latha" w:hAnsi="Latha" w:cs="Latha"/>
+                <w:b/>
+                <w:bCs/>
+                <w:szCs w:val="24"/>
+                <w:lang w:bidi="ta-IN"/>
+              </w:rPr>
+              <w:t>)</w:t>
+            </w:r>
+            <w:r>
+              <w:rPr>
+                <w:rFonts w:ascii="BRH Tamil Tab Extra" w:hAnsi="BRH Tamil Tab Extra" w:cs="Latha"/>
+                <w:b/>
+                <w:bCs/>
+                <w:szCs w:val="28"/>
+                <w:lang w:bidi="ta-IN"/>
+              </w:rPr>
+              <w:t>†</w:t>
+            </w:r>
+            <w:r>
+              <w:rPr>
+                <w:rFonts w:ascii="Latha" w:hAnsi="Latha" w:cs="Latha"/>
+                <w:szCs w:val="24"/>
+                <w:cs/>
+                <w:lang w:bidi="ta-IN"/>
+              </w:rPr>
+              <w:t xml:space="preserve">ஸி </w:t>
+            </w:r>
+            <w:r>
+              <w:rPr>
+                <w:rFonts w:ascii="Latha" w:hAnsi="Latha" w:cs="Latha"/>
+                <w:szCs w:val="24"/>
+                <w:lang w:bidi="ta-IN"/>
+              </w:rPr>
+              <w:t>||</w:t>
+            </w:r>
+          </w:p>
+          <w:p>
+            <w:pPr>
+              <w:autoSpaceDE w:val="0"/>
+              <w:autoSpaceDN w:val="0"/>
+              <w:adjustRightInd w:val="0"/>
+              <w:spacing w:before="0" w:line="240" w:lineRule="auto"/>
+              <w:rPr>
+                <w:rFonts w:cs="ar"/>
+                <w:color w:val="000000"/>
+                <w:szCs w:val="36"/>
+              </w:rPr>
+            </w:pPr>
+            <w:r>
+              <w:rPr>
+                <w:rFonts w:ascii="Latha" w:hAnsi="Latha" w:cs="Latha"/>
+                <w:szCs w:val="24"/>
+                <w:highlight w:val="green"/>
+                <w:cs/>
+                <w:lang w:bidi="ta-IN"/>
+              </w:rPr>
+              <w:t>ஶ்ர</w:t>
+            </w:r>
+            <w:r>
+              <w:rPr>
+                <w:rFonts w:ascii="Latha" w:hAnsi="Latha" w:cs="Latha"/>
+                <w:szCs w:val="24"/>
+                <w:cs/>
+                <w:lang w:bidi="ta-IN"/>
+              </w:rPr>
+              <w:t>வா</w:t>
+            </w:r>
+            <w:r>
+              <w:rPr>
+                <w:rFonts w:ascii="BRH Malayalam Extra" w:hAnsi="BRH Malayalam Extra" w:cs="BRH Devanagari Extra"/>
+                <w:color w:val="000000"/>
+                <w:szCs w:val="32"/>
+              </w:rPr>
+              <w:t>–</w:t>
+            </w:r>
+            <w:r>
+              <w:rPr>
+                <w:rFonts w:ascii="BRH Tamil Tab Extra" w:hAnsi="BRH Tamil Tab Extra" w:cs="Latha"/>
+                <w:b/>
+                <w:bCs/>
+                <w:szCs w:val="28"/>
+                <w:lang w:bidi="ta-IN"/>
+              </w:rPr>
+              <w:t>…</w:t>
+            </w:r>
+            <w:r>
+              <w:rPr>
+                <w:rFonts w:ascii="Latha" w:hAnsi="Latha" w:cs="Latha"/>
+                <w:b/>
+                <w:bCs/>
+                <w:szCs w:val="24"/>
+                <w:lang w:bidi="ta-IN"/>
+              </w:rPr>
+              <w:t>(</w:t>
+            </w:r>
+            <w:r>
+              <w:rPr>
+                <w:rFonts w:ascii="Latha" w:hAnsi="Latha" w:cs="Latha"/>
+                <w:szCs w:val="24"/>
+                <w:cs/>
+                <w:lang w:bidi="ta-IN"/>
+              </w:rPr>
+              <w:t>க்ம்</w:t>
+            </w:r>
+            <w:r>
+              <w:rPr>
+                <w:rFonts w:ascii="Latha" w:hAnsi="Latha" w:cs="Latha"/>
+                <w:b/>
+                <w:bCs/>
+                <w:szCs w:val="24"/>
+                <w:lang w:bidi="ta-IN"/>
+              </w:rPr>
+              <w:t>)</w:t>
+            </w:r>
+            <w:r>
+              <w:rPr>
+                <w:rFonts w:ascii="BRH Tamil Tab Extra" w:hAnsi="BRH Tamil Tab Extra" w:cs="Latha"/>
+                <w:b/>
+                <w:bCs/>
+                <w:szCs w:val="28"/>
+                <w:lang w:bidi="ta-IN"/>
+              </w:rPr>
+              <w:t>…</w:t>
+            </w:r>
+            <w:r>
+              <w:rPr>
+                <w:rFonts w:ascii="Latha" w:hAnsi="Latha" w:cs="Latha"/>
+                <w:szCs w:val="24"/>
+                <w:cs/>
+                <w:lang w:bidi="ta-IN"/>
+              </w:rPr>
+              <w:t>ஸீதி</w:t>
+            </w:r>
+            <w:r>
+              <w:rPr>
+                <w:rFonts w:ascii="BRH Tamil Tab Extra" w:hAnsi="BRH Tamil Tab Extra" w:cs="Latha"/>
+                <w:b/>
+                <w:bCs/>
+                <w:szCs w:val="28"/>
+                <w:lang w:bidi="ta-IN"/>
+              </w:rPr>
+              <w:t>…</w:t>
+            </w:r>
+            <w:r>
+              <w:rPr>
+                <w:rFonts w:ascii="Latha" w:hAnsi="Latha" w:cs="Latha"/>
+                <w:szCs w:val="24"/>
+                <w:lang w:bidi="ta-IN"/>
+              </w:rPr>
+              <w:t xml:space="preserve"> </w:t>
+            </w:r>
+            <w:r>
+              <w:rPr>
+                <w:rFonts w:ascii="Latha" w:hAnsi="Latha" w:cs="Latha"/>
+                <w:szCs w:val="24"/>
+                <w:cs/>
+                <w:lang w:bidi="ta-IN"/>
+              </w:rPr>
+              <w:t>ஶ்ரவா</w:t>
+            </w:r>
+            <w:r>
+              <w:rPr>
+                <w:rFonts w:ascii="Latha" w:hAnsi="Latha" w:cs="Latha"/>
+                <w:b/>
+                <w:bCs/>
+                <w:szCs w:val="24"/>
+                <w:lang w:bidi="ta-IN"/>
+              </w:rPr>
+              <w:t>(</w:t>
+            </w:r>
+            <w:r>
+              <w:rPr>
+                <w:rFonts w:ascii="Latha" w:hAnsi="Latha" w:cs="Latha"/>
+                <w:szCs w:val="24"/>
+                <w:cs/>
+                <w:lang w:bidi="ta-IN"/>
+              </w:rPr>
+              <w:t>க்ம்</w:t>
+            </w:r>
+            <w:r>
+              <w:rPr>
+                <w:rFonts w:ascii="Latha" w:hAnsi="Latha" w:cs="Latha"/>
+                <w:b/>
+                <w:bCs/>
+                <w:szCs w:val="24"/>
+                <w:lang w:bidi="ta-IN"/>
+              </w:rPr>
+              <w:t>)</w:t>
+            </w:r>
+            <w:r>
+              <w:rPr>
+                <w:rFonts w:ascii="BRH Tamil Tab Extra" w:hAnsi="BRH Tamil Tab Extra" w:cs="Latha"/>
+                <w:b/>
+                <w:bCs/>
+                <w:szCs w:val="28"/>
+                <w:lang w:bidi="ta-IN"/>
+              </w:rPr>
+              <w:t>†</w:t>
+            </w:r>
+            <w:r>
+              <w:rPr>
+                <w:rFonts w:ascii="Latha" w:hAnsi="Latha" w:cs="Latha"/>
+                <w:szCs w:val="24"/>
+                <w:cs/>
+                <w:lang w:bidi="ta-IN"/>
+              </w:rPr>
+              <w:t xml:space="preserve">ஸி </w:t>
+            </w:r>
+            <w:r>
+              <w:rPr>
+                <w:rFonts w:ascii="Latha" w:hAnsi="Latha" w:cs="Latha"/>
+                <w:szCs w:val="24"/>
+                <w:lang w:bidi="ta-IN"/>
+              </w:rPr>
+              <w:t xml:space="preserve">| </w:t>
+            </w:r>
           </w:p>
         </w:tc>
       </w:tr>
     </w:tbl>
+    <w:p>
+      <w:pPr>
+        <w:spacing w:before="0" w:line="240" w:lineRule="auto"/>
+        <w:jc w:val="center"/>
+        <w:rPr>
+          <w:b/>
+          <w:bCs/>
+          <w:sz w:val="32"/>
+          <w:szCs w:val="32"/>
+          <w:u w:val="single"/>
+        </w:rPr>
+      </w:pPr>
+    </w:p>
+    <w:p>
+      <w:pPr>
+        <w:spacing w:before="0" w:line="240" w:lineRule="auto"/>
+        <w:jc w:val="center"/>
+        <w:rPr>
+          <w:b/>
+          <w:bCs/>
+          <w:sz w:val="32"/>
+          <w:szCs w:val="32"/>
+          <w:u w:val="single"/>
+        </w:rPr>
+      </w:pPr>
+      <w:r>
+        <w:rPr>
+          <w:b/>
+          <w:bCs/>
+          <w:sz w:val="32"/>
+          <w:szCs w:val="32"/>
+          <w:u w:val="single"/>
+        </w:rPr>
+        <w:t>-------------------------------------------------</w:t>
+      </w:r>
+    </w:p>
+    <w:p>
+      <w:pPr>
+        <w:spacing w:before="0" w:line="240" w:lineRule="auto"/>
+        <w:jc w:val="center"/>
+        <w:rPr>
+          <w:b/>
+          <w:bCs/>
+          <w:sz w:val="32"/>
+          <w:szCs w:val="32"/>
+          <w:u w:val="single"/>
+        </w:rPr>
+      </w:pPr>
+    </w:p>
+    <w:p>
+      <w:pPr>
+        <w:spacing w:before="0" w:line="240" w:lineRule="auto"/>
+        <w:jc w:val="center"/>
+        <w:rPr>
+          <w:b/>
+          <w:bCs/>
+          <w:sz w:val="32"/>
+          <w:szCs w:val="32"/>
+          <w:u w:val="single"/>
+        </w:rPr>
+      </w:pPr>
+    </w:p>
+    <w:p>
+      <w:pPr>
+        <w:spacing w:before="0" w:line="240" w:lineRule="auto"/>
+        <w:jc w:val="center"/>
+        <w:rPr>
+          <w:b/>
+          <w:bCs/>
+          <w:sz w:val="32"/>
+          <w:szCs w:val="32"/>
+          <w:u w:val="single"/>
+        </w:rPr>
+      </w:pPr>
+    </w:p>
+    <w:p>
+      <w:pPr>
+        <w:spacing w:before="0" w:line="240" w:lineRule="auto"/>
+        <w:jc w:val="center"/>
+        <w:rPr>
+          <w:b/>
+          <w:bCs/>
+          <w:sz w:val="32"/>
+          <w:szCs w:val="32"/>
+          <w:u w:val="single"/>
+        </w:rPr>
+      </w:pPr>
+    </w:p>
+    <w:p>
+      <w:pPr>
+        <w:spacing w:before="0" w:line="240" w:lineRule="auto"/>
+        <w:jc w:val="center"/>
+        <w:rPr>
+          <w:b/>
+          <w:bCs/>
+          <w:sz w:val="32"/>
+          <w:szCs w:val="32"/>
+          <w:u w:val="single"/>
+        </w:rPr>
+      </w:pPr>
+    </w:p>
     <w:p>
       <w:pPr>
         <w:spacing w:before="0" w:line="240" w:lineRule="auto"/>
@@ -4047,7 +4149,6 @@
                 <w:cs/>
                 <w:lang w:bidi="ta-IN"/>
               </w:rPr>
-              <w:lastRenderedPageBreak/>
               <w:t>15</w:t>
             </w:r>
             <w:r>
@@ -8325,17 +8426,7 @@
                 <w:cs/>
                 <w:lang w:bidi="ta-IN"/>
               </w:rPr>
-              <w:t xml:space="preserve">ஶோ </w:t>
-            </w:r>
-            <w:r>
-              <w:rPr>
-                <w:rFonts w:ascii="Latha" w:hAnsi="Latha" w:cs="Latha"/>
-                <w:szCs w:val="24"/>
-                <w:cs/>
-                <w:lang w:bidi="ta-IN"/>
-              </w:rPr>
-              <w:lastRenderedPageBreak/>
-              <w:t>ரால</w:t>
+              <w:t>ஶோ ரால</w:t>
             </w:r>
             <w:r>
               <w:rPr>
@@ -11413,7 +11504,6 @@
                 <w:cs/>
                 <w:lang w:bidi="ta-IN"/>
               </w:rPr>
-              <w:lastRenderedPageBreak/>
               <w:t>45</w:t>
             </w:r>
             <w:r>
@@ -15204,7 +15294,17 @@
                 <w:cs/>
                 <w:lang w:bidi="ta-IN"/>
               </w:rPr>
-              <w:t>தா த்</w:t>
+              <w:t xml:space="preserve">தா </w:t>
+            </w:r>
+            <w:r>
+              <w:rPr>
+                <w:rFonts w:ascii="Latha" w:hAnsi="Latha" w:cs="Latha"/>
+                <w:szCs w:val="24"/>
+                <w:cs/>
+                <w:lang w:bidi="ta-IN"/>
+              </w:rPr>
+              <w:lastRenderedPageBreak/>
+              <w:t>த்</w:t>
             </w:r>
             <w:r>
               <w:rPr>
@@ -15499,6 +15599,7 @@
                 <w:cs/>
                 <w:lang w:bidi="ta-IN"/>
               </w:rPr>
+              <w:lastRenderedPageBreak/>
               <w:t>1</w:t>
             </w:r>
             <w:r>
@@ -16277,7 +16378,17 @@
                 <w:cs/>
                 <w:lang w:bidi="ta-IN"/>
               </w:rPr>
-              <w:t>தா த்</w:t>
+              <w:t xml:space="preserve">தா </w:t>
+            </w:r>
+            <w:r>
+              <w:rPr>
+                <w:rFonts w:ascii="Latha" w:hAnsi="Latha" w:cs="Latha"/>
+                <w:szCs w:val="24"/>
+                <w:cs/>
+                <w:lang w:bidi="ta-IN"/>
+              </w:rPr>
+              <w:lastRenderedPageBreak/>
+              <w:t>த்</w:t>
             </w:r>
             <w:r>
               <w:rPr>
@@ -21628,6 +21739,7 @@
                 <w:cs/>
                 <w:lang w:bidi="ta-IN"/>
               </w:rPr>
+              <w:lastRenderedPageBreak/>
               <w:t>35</w:t>
             </w:r>
             <w:r>
@@ -22082,17 +22194,7 @@
                 <w:cs/>
                 <w:lang w:bidi="ta-IN"/>
               </w:rPr>
-              <w:t xml:space="preserve">வா </w:t>
-            </w:r>
-            <w:r>
-              <w:rPr>
-                <w:rFonts w:ascii="Latha" w:hAnsi="Latha" w:cs="Latha"/>
-                <w:szCs w:val="24"/>
-                <w:cs/>
-                <w:lang w:bidi="ta-IN"/>
-              </w:rPr>
-              <w:lastRenderedPageBreak/>
-              <w:t>வ</w:t>
+              <w:t>வா வ</w:t>
             </w:r>
             <w:r>
               <w:rPr>
@@ -24907,7 +25009,17 @@
                 <w:cs/>
                 <w:lang w:bidi="ta-IN"/>
               </w:rPr>
-              <w:t xml:space="preserve"> ஸஹஸ்ரயா</w:t>
+              <w:t xml:space="preserve"> </w:t>
+            </w:r>
+            <w:r>
+              <w:rPr>
+                <w:rFonts w:ascii="Latha" w:hAnsi="Latha" w:cs="Latha"/>
+                <w:szCs w:val="24"/>
+                <w:cs/>
+                <w:lang w:bidi="ta-IN"/>
+              </w:rPr>
+              <w:lastRenderedPageBreak/>
+              <w:t>ஸஹஸ்ரயா</w:t>
             </w:r>
             <w:r>
               <w:rPr>
@@ -25046,7 +25158,6 @@
                 <w:szCs w:val="28"/>
                 <w:lang w:bidi="ta-IN"/>
               </w:rPr>
-              <w:lastRenderedPageBreak/>
               <w:t>Å</w:t>
             </w:r>
             <w:r>
@@ -26323,17 +26434,7 @@
                 <w:cs/>
                 <w:lang w:bidi="ta-IN"/>
               </w:rPr>
-              <w:t xml:space="preserve">வா </w:t>
-            </w:r>
-            <w:r>
-              <w:rPr>
-                <w:rFonts w:ascii="Latha" w:hAnsi="Latha" w:cs="Latha"/>
-                <w:szCs w:val="24"/>
-                <w:cs/>
-                <w:lang w:bidi="ta-IN"/>
-              </w:rPr>
-              <w:lastRenderedPageBreak/>
-              <w:t>வ</w:t>
+              <w:t>வா வ</w:t>
             </w:r>
             <w:r>
               <w:rPr>
@@ -29018,7 +29119,17 @@
                 <w:cs/>
                 <w:lang w:bidi="ta-IN"/>
               </w:rPr>
-              <w:t xml:space="preserve"> ஸஹஸ்ரயா</w:t>
+              <w:t xml:space="preserve"> </w:t>
+            </w:r>
+            <w:r>
+              <w:rPr>
+                <w:rFonts w:ascii="Latha" w:hAnsi="Latha" w:cs="Latha"/>
+                <w:szCs w:val="24"/>
+                <w:cs/>
+                <w:lang w:bidi="ta-IN"/>
+              </w:rPr>
+              <w:lastRenderedPageBreak/>
+              <w:t>ஸஹஸ்ரயா</w:t>
             </w:r>
             <w:r>
               <w:rPr>
@@ -29545,7 +29656,6 @@
                 <w:cs/>
                 <w:lang w:bidi="ta-IN"/>
               </w:rPr>
-              <w:lastRenderedPageBreak/>
               <w:t>38</w:t>
             </w:r>
             <w:r>
@@ -31949,6 +32059,7 @@
                 <w:cs/>
                 <w:lang w:bidi="ta-IN"/>
               </w:rPr>
+              <w:lastRenderedPageBreak/>
               <w:t>38</w:t>
             </w:r>
             <w:r>
@@ -32303,7 +32414,6 @@
                 <w:cs/>
                 <w:lang w:bidi="ta-IN"/>
               </w:rPr>
-              <w:lastRenderedPageBreak/>
               <w:t>ஸூர்ய</w:t>
             </w:r>
             <w:r>
@@ -35556,22 +35666,6 @@
               <w:t>|</w:t>
             </w:r>
           </w:p>
-          <w:bookmarkEnd w:id="5"/>
-          <w:p>
-            <w:pPr>
-              <w:widowControl w:val="0"/>
-              <w:autoSpaceDE w:val="0"/>
-              <w:autoSpaceDN w:val="0"/>
-              <w:adjustRightInd w:val="0"/>
-              <w:spacing w:before="0" w:line="240" w:lineRule="auto"/>
-              <w:rPr>
-                <w:rFonts w:ascii="BRH Devanagari Extra" w:hAnsi="BRH Devanagari Extra" w:cs="BRH Devanagari Extra"/>
-                <w:color w:val="000000"/>
-                <w:sz w:val="32"/>
-                <w:szCs w:val="32"/>
-              </w:rPr>
-            </w:pPr>
-          </w:p>
           <w:p>
             <w:pPr>
               <w:autoSpaceDE w:val="0"/>
@@ -35584,15 +35678,17 @@
               </w:rPr>
             </w:pPr>
             <w:bookmarkStart w:id="6" w:name="_Hlk157801912"/>
-            <w:r>
-              <w:rPr>
-                <w:rFonts w:ascii="Latha" w:hAnsi="Latha" w:cs="Latha"/>
-                <w:b/>
-                <w:bCs/>
-                <w:szCs w:val="24"/>
-                <w:cs/>
-                <w:lang w:bidi="ta-IN"/>
-              </w:rPr>
+            <w:bookmarkEnd w:id="5"/>
+            <w:r>
+              <w:rPr>
+                <w:rFonts w:ascii="Latha" w:hAnsi="Latha" w:cs="Latha"/>
+                <w:b/>
+                <w:bCs/>
+                <w:szCs w:val="24"/>
+                <w:cs/>
+                <w:lang w:bidi="ta-IN"/>
+              </w:rPr>
+              <w:lastRenderedPageBreak/>
               <w:t>38</w:t>
             </w:r>
             <w:r>
@@ -35971,7 +36067,6 @@
                 <w:cs/>
                 <w:lang w:bidi="ta-IN"/>
               </w:rPr>
-              <w:lastRenderedPageBreak/>
               <w:t>ஸூர்ய</w:t>
             </w:r>
             <w:r>
@@ -38679,6 +38774,7 @@
                 <w:cs/>
                 <w:lang w:bidi="ta-IN"/>
               </w:rPr>
+              <w:lastRenderedPageBreak/>
               <w:t>3)</w:t>
             </w:r>
             <w:r>
@@ -39233,17 +39329,7 @@
                 <w:cs/>
                 <w:lang w:bidi="ta-IN"/>
               </w:rPr>
-              <w:t xml:space="preserve">ரதா ஶமயதி ஶமய </w:t>
-            </w:r>
-            <w:r>
-              <w:rPr>
-                <w:rFonts w:ascii="Latha" w:hAnsi="Latha" w:cs="Latha"/>
-                <w:szCs w:val="24"/>
-                <w:cs/>
-                <w:lang w:bidi="ta-IN"/>
-              </w:rPr>
-              <w:lastRenderedPageBreak/>
-              <w:t>த்யபி</w:t>
+              <w:t>ரதா ஶமயதி ஶமய த்யபி</w:t>
             </w:r>
             <w:r>
               <w:rPr>
@@ -41470,6 +41556,7 @@
                 <w:cs/>
                 <w:lang w:bidi="ta-IN"/>
               </w:rPr>
+              <w:lastRenderedPageBreak/>
               <w:t>3)</w:t>
             </w:r>
             <w:r>
@@ -42026,17 +42113,7 @@
                 <w:cs/>
                 <w:lang w:bidi="ta-IN"/>
               </w:rPr>
-              <w:t xml:space="preserve">தா ஶமயதி ஶமய </w:t>
-            </w:r>
-            <w:r>
-              <w:rPr>
-                <w:rFonts w:ascii="Latha" w:hAnsi="Latha" w:cs="Latha"/>
-                <w:szCs w:val="24"/>
-                <w:cs/>
-                <w:lang w:bidi="ta-IN"/>
-              </w:rPr>
-              <w:lastRenderedPageBreak/>
-              <w:t>த்யபி</w:t>
+              <w:t>தா ஶமயதி ஶமய த்யபி</w:t>
             </w:r>
             <w:r>
               <w:rPr>
@@ -44744,6 +44821,7 @@
                 <w:cs/>
                 <w:lang w:bidi="ta-IN"/>
               </w:rPr>
+              <w:lastRenderedPageBreak/>
               <w:t>30</w:t>
             </w:r>
             <w:r>
@@ -45579,7 +45657,6 @@
                 <w:cs/>
                 <w:lang w:bidi="ta-IN"/>
               </w:rPr>
-              <w:lastRenderedPageBreak/>
               <w:t>29</w:t>
             </w:r>
             <w:r>
@@ -50052,6 +50129,7 @@
                 <w:cs/>
                 <w:lang w:bidi="ta-IN"/>
               </w:rPr>
+              <w:lastRenderedPageBreak/>
               <w:t>48</w:t>
             </w:r>
             <w:r>
@@ -50838,7 +50916,6 @@
                 <w:cs/>
                 <w:lang w:bidi="ta-IN"/>
               </w:rPr>
-              <w:lastRenderedPageBreak/>
               <w:t>ம</w:t>
             </w:r>
             <w:r>
@@ -52608,6 +52685,7 @@
                 <w:cs/>
                 <w:lang w:bidi="ta-IN"/>
               </w:rPr>
+              <w:lastRenderedPageBreak/>
               <w:t>48</w:t>
             </w:r>
             <w:r>
@@ -53480,7 +53558,6 @@
                 <w:cs/>
                 <w:lang w:bidi="ta-IN"/>
               </w:rPr>
-              <w:lastRenderedPageBreak/>
               <w:t>49</w:t>
             </w:r>
             <w:r>
@@ -54415,19 +54492,6 @@
         </w:tc>
       </w:tr>
     </w:tbl>
-    <w:p>
-      <w:pPr>
-        <w:spacing w:before="0" w:line="240" w:lineRule="auto"/>
-        <w:jc w:val="center"/>
-        <w:rPr>
-          <w:b/>
-          <w:bCs/>
-          <w:sz w:val="32"/>
-          <w:szCs w:val="32"/>
-          <w:u w:val="single"/>
-        </w:rPr>
-      </w:pPr>
-    </w:p>
     <w:p>
       <w:pPr>
         <w:spacing w:before="0" w:line="240" w:lineRule="auto"/>
@@ -54448,6 +54512,7 @@
           <w:szCs w:val="32"/>
           <w:u w:val="single"/>
         </w:rPr>
+        <w:lastRenderedPageBreak/>
         <w:t>==========</w:t>
       </w:r>
     </w:p>
@@ -54841,6 +54906,7 @@
     <w:p>
       <w:pPr>
         <w:spacing w:before="0" w:line="240" w:lineRule="auto"/>
+        <w:jc w:val="center"/>
         <w:rPr>
           <w:b/>
           <w:bCs/>
@@ -54849,6 +54915,16 @@
           <w:u w:val="single"/>
         </w:rPr>
       </w:pPr>
+      <w:r>
+        <w:rPr>
+          <w:b/>
+          <w:bCs/>
+          <w:sz w:val="32"/>
+          <w:szCs w:val="32"/>
+          <w:u w:val="single"/>
+        </w:rPr>
+        <w:t>=================================</w:t>
+      </w:r>
     </w:p>
     <w:sectPr>
       <w:headerReference w:type="even" r:id="rId7"/>
@@ -54865,7 +54941,7 @@
 </file>
 
 <file path=word/endnotes.xml><?xml version="1.0" encoding="utf-8"?>
-<w:endnotes xmlns:wpc="http://schemas.microsoft.com/office/word/2010/wordprocessingCanvas" xmlns:cx="http://schemas.microsoft.com/office/drawing/2014/chartex" xmlns:cx1="http://schemas.microsoft.com/office/drawing/2015/9/8/chartex" xmlns:cx2="http://schemas.microsoft.com/office/drawing/2015/10/21/chartex" xmlns:cx3="http://schemas.microsoft.com/office/drawing/2016/5/9/chartex" xmlns:cx4="http://schemas.microsoft.com/office/drawing/2016/5/10/chartex" xmlns:cx5="http://schemas.microsoft.com/office/drawing/2016/5/11/chartex" xmlns:cx6="http://schemas.microsoft.com/office/drawing/2016/5/12/chartex" xmlns:cx7="http://schemas.microsoft.com/office/drawing/2016/5/13/chartex" xmlns:cx8="http://schemas.microsoft.com/office/drawing/2016/5/14/chartex" xmlns:mc="http://schemas.openxmlformats.org/markup-compatibility/2006" xmlns:aink="http://schemas.microsoft.com/office/drawing/2016/ink" xmlns:am3d="http://schemas.microsoft.com/office/drawing/2017/model3d" xmlns:o="urn:schemas-microsoft-com:office:office" xmlns:oel="http://schemas.microsoft.com/office/2019/extlst" xmlns:r="http://schemas.openxmlformats.org/officeDocument/2006/relationships" xmlns:m="http://schemas.openxmlformats.org/officeDocument/2006/math" xmlns:v="urn:schemas-microsoft-com:vml" xmlns:wp14="http://schemas.microsoft.com/office/word/2010/wordprocessingDrawing" xmlns:wp="http://schemas.openxmlformats.org/drawingml/2006/wordprocessingDrawing" xmlns:w10="urn:schemas-microsoft-com:office:word" xmlns:w="http://schemas.openxmlformats.org/wordprocessingml/2006/main" xmlns:w14="http://schemas.microsoft.com/office/word/2010/wordml" xmlns:w15="http://schemas.microsoft.com/office/word/2012/wordml" xmlns:w16cei="http://schemas.microsoft.com/office/word/2026/wordml/cei" xmlns:w16cex="http://schemas.microsoft.com/office/word/2018/wordml/cex" xmlns:w16cid="http://schemas.microsoft.com/office/word/2016/wordml/cid" xmlns:w16="http://schemas.microsoft.com/office/word/2018/wordml" xmlns:w16du="http://schemas.microsoft.com/office/word/2023/wordml/word16du" xmlns:w16sdtdh="http://schemas.microsoft.com/office/word/2020/wordml/sdtdatahash" xmlns:w16sdtfl="http://schemas.microsoft.com/office/word/2024/wordml/sdtformatlock" xmlns:w16se="http://schemas.microsoft.com/office/word/2015/wordml/symex" xmlns:wpg="http://schemas.microsoft.com/office/word/2010/wordprocessingGroup" xmlns:wpi="http://schemas.microsoft.com/office/word/2010/wordprocessingInk" xmlns:wne="http://schemas.microsoft.com/office/word/2006/wordml" xmlns:wps="http://schemas.microsoft.com/office/word/2010/wordprocessingShape" mc:Ignorable="w14 w15 w16se w16cid w16 w16cex w16sdtdh w16sdtfl w16du wp14">
+<w:endnotes xmlns:wpc="http://schemas.microsoft.com/office/word/2010/wordprocessingCanvas" xmlns:cx="http://schemas.microsoft.com/office/drawing/2014/chartex" xmlns:cx1="http://schemas.microsoft.com/office/drawing/2015/9/8/chartex" xmlns:cx2="http://schemas.microsoft.com/office/drawing/2015/10/21/chartex" xmlns:cx3="http://schemas.microsoft.com/office/drawing/2016/5/9/chartex" xmlns:cx4="http://schemas.microsoft.com/office/drawing/2016/5/10/chartex" xmlns:cx5="http://schemas.microsoft.com/office/drawing/2016/5/11/chartex" xmlns:cx6="http://schemas.microsoft.com/office/drawing/2016/5/12/chartex" xmlns:cx7="http://schemas.microsoft.com/office/drawing/2016/5/13/chartex" xmlns:cx8="http://schemas.microsoft.com/office/drawing/2016/5/14/chartex" xmlns:mc="http://schemas.openxmlformats.org/markup-compatibility/2006" xmlns:aink="http://schemas.microsoft.com/office/drawing/2016/ink" xmlns:am3d="http://schemas.microsoft.com/office/drawing/2017/model3d" xmlns:o="urn:schemas-microsoft-com:office:office" xmlns:oel="http://schemas.microsoft.com/office/2019/extlst" xmlns:r="http://schemas.openxmlformats.org/officeDocument/2006/relationships" xmlns:m="http://schemas.openxmlformats.org/officeDocument/2006/math" xmlns:v="urn:schemas-microsoft-com:vml" xmlns:wp14="http://schemas.microsoft.com/office/word/2010/wordprocessingDrawing" xmlns:wp="http://schemas.openxmlformats.org/drawingml/2006/wordprocessingDrawing" xmlns:w10="urn:schemas-microsoft-com:office:word" xmlns:w="http://schemas.openxmlformats.org/wordprocessingml/2006/main" xmlns:w14="http://schemas.microsoft.com/office/word/2010/wordml" xmlns:w15="http://schemas.microsoft.com/office/word/2012/wordml" xmlns:w16cex="http://schemas.microsoft.com/office/word/2018/wordml/cex" xmlns:w16cid="http://schemas.microsoft.com/office/word/2016/wordml/cid" xmlns:w16="http://schemas.microsoft.com/office/word/2018/wordml" xmlns:w16du="http://schemas.microsoft.com/office/word/2023/wordml/word16du" xmlns:w16sdtdh="http://schemas.microsoft.com/office/word/2020/wordml/sdtdatahash" xmlns:w16sdtfl="http://schemas.microsoft.com/office/word/2024/wordml/sdtformatlock" xmlns:w16se="http://schemas.microsoft.com/office/word/2015/wordml/symex" xmlns:wpg="http://schemas.microsoft.com/office/word/2010/wordprocessingGroup" xmlns:wpi="http://schemas.microsoft.com/office/word/2010/wordprocessingInk" xmlns:wne="http://schemas.microsoft.com/office/word/2006/wordml" xmlns:wps="http://schemas.microsoft.com/office/word/2010/wordprocessingShape" mc:Ignorable="w14 w15 w16se w16cid w16 w16cex w16sdtdh w16sdtfl w16du wp14">
   <w:endnote w:type="separator" w:id="-1">
     <w:p>
       <w:pPr>
@@ -54890,7 +54966,7 @@
 </file>
 
 <file path=word/footer1.xml><?xml version="1.0" encoding="utf-8"?>
-<w:ftr xmlns:wpc="http://schemas.microsoft.com/office/word/2010/wordprocessingCanvas" xmlns:cx="http://schemas.microsoft.com/office/drawing/2014/chartex" xmlns:cx1="http://schemas.microsoft.com/office/drawing/2015/9/8/chartex" xmlns:cx2="http://schemas.microsoft.com/office/drawing/2015/10/21/chartex" xmlns:cx3="http://schemas.microsoft.com/office/drawing/2016/5/9/chartex" xmlns:cx4="http://schemas.microsoft.com/office/drawing/2016/5/10/chartex" xmlns:cx5="http://schemas.microsoft.com/office/drawing/2016/5/11/chartex" xmlns:cx6="http://schemas.microsoft.com/office/drawing/2016/5/12/chartex" xmlns:cx7="http://schemas.microsoft.com/office/drawing/2016/5/13/chartex" xmlns:cx8="http://schemas.microsoft.com/office/drawing/2016/5/14/chartex" xmlns:mc="http://schemas.openxmlformats.org/markup-compatibility/2006" xmlns:aink="http://schemas.microsoft.com/office/drawing/2016/ink" xmlns:am3d="http://schemas.microsoft.com/office/drawing/2017/model3d" xmlns:o="urn:schemas-microsoft-com:office:office" xmlns:oel="http://schemas.microsoft.com/office/2019/extlst" xmlns:r="http://schemas.openxmlformats.org/officeDocument/2006/relationships" xmlns:m="http://schemas.openxmlformats.org/officeDocument/2006/math" xmlns:v="urn:schemas-microsoft-com:vml" xmlns:wp14="http://schemas.microsoft.com/office/word/2010/wordprocessingDrawing" xmlns:wp="http://schemas.openxmlformats.org/drawingml/2006/wordprocessingDrawing" xmlns:w10="urn:schemas-microsoft-com:office:word" xmlns:w="http://schemas.openxmlformats.org/wordprocessingml/2006/main" xmlns:w14="http://schemas.microsoft.com/office/word/2010/wordml" xmlns:w15="http://schemas.microsoft.com/office/word/2012/wordml" xmlns:w16cei="http://schemas.microsoft.com/office/word/2026/wordml/cei" xmlns:w16cex="http://schemas.microsoft.com/office/word/2018/wordml/cex" xmlns:w16cid="http://schemas.microsoft.com/office/word/2016/wordml/cid" xmlns:w16="http://schemas.microsoft.com/office/word/2018/wordml" xmlns:w16du="http://schemas.microsoft.com/office/word/2023/wordml/word16du" xmlns:w16sdtdh="http://schemas.microsoft.com/office/word/2020/wordml/sdtdatahash" xmlns:w16sdtfl="http://schemas.microsoft.com/office/word/2024/wordml/sdtformatlock" xmlns:w16se="http://schemas.microsoft.com/office/word/2015/wordml/symex" xmlns:wpg="http://schemas.microsoft.com/office/word/2010/wordprocessingGroup" xmlns:wpi="http://schemas.microsoft.com/office/word/2010/wordprocessingInk" xmlns:wne="http://schemas.microsoft.com/office/word/2006/wordml" xmlns:wps="http://schemas.microsoft.com/office/word/2010/wordprocessingShape" mc:Ignorable="w14 w15 w16se w16cid w16 w16cex w16sdtdh w16sdtfl w16du wp14">
+<w:ftr xmlns:wpc="http://schemas.microsoft.com/office/word/2010/wordprocessingCanvas" xmlns:cx="http://schemas.microsoft.com/office/drawing/2014/chartex" xmlns:cx1="http://schemas.microsoft.com/office/drawing/2015/9/8/chartex" xmlns:cx2="http://schemas.microsoft.com/office/drawing/2015/10/21/chartex" xmlns:cx3="http://schemas.microsoft.com/office/drawing/2016/5/9/chartex" xmlns:cx4="http://schemas.microsoft.com/office/drawing/2016/5/10/chartex" xmlns:cx5="http://schemas.microsoft.com/office/drawing/2016/5/11/chartex" xmlns:cx6="http://schemas.microsoft.com/office/drawing/2016/5/12/chartex" xmlns:cx7="http://schemas.microsoft.com/office/drawing/2016/5/13/chartex" xmlns:cx8="http://schemas.microsoft.com/office/drawing/2016/5/14/chartex" xmlns:mc="http://schemas.openxmlformats.org/markup-compatibility/2006" xmlns:aink="http://schemas.microsoft.com/office/drawing/2016/ink" xmlns:am3d="http://schemas.microsoft.com/office/drawing/2017/model3d" xmlns:o="urn:schemas-microsoft-com:office:office" xmlns:oel="http://schemas.microsoft.com/office/2019/extlst" xmlns:r="http://schemas.openxmlformats.org/officeDocument/2006/relationships" xmlns:m="http://schemas.openxmlformats.org/officeDocument/2006/math" xmlns:v="urn:schemas-microsoft-com:vml" xmlns:wp14="http://schemas.microsoft.com/office/word/2010/wordprocessingDrawing" xmlns:wp="http://schemas.openxmlformats.org/drawingml/2006/wordprocessingDrawing" xmlns:w10="urn:schemas-microsoft-com:office:word" xmlns:w="http://schemas.openxmlformats.org/wordprocessingml/2006/main" xmlns:w14="http://schemas.microsoft.com/office/word/2010/wordml" xmlns:w15="http://schemas.microsoft.com/office/word/2012/wordml" xmlns:w16cex="http://schemas.microsoft.com/office/word/2018/wordml/cex" xmlns:w16cid="http://schemas.microsoft.com/office/word/2016/wordml/cid" xmlns:w16="http://schemas.microsoft.com/office/word/2018/wordml" xmlns:w16du="http://schemas.microsoft.com/office/word/2023/wordml/word16du" xmlns:w16sdtdh="http://schemas.microsoft.com/office/word/2020/wordml/sdtdatahash" xmlns:w16sdtfl="http://schemas.microsoft.com/office/word/2024/wordml/sdtformatlock" xmlns:w16se="http://schemas.microsoft.com/office/word/2015/wordml/symex" xmlns:wpg="http://schemas.microsoft.com/office/word/2010/wordprocessingGroup" xmlns:wpi="http://schemas.microsoft.com/office/word/2010/wordprocessingInk" xmlns:wne="http://schemas.microsoft.com/office/word/2006/wordml" xmlns:wps="http://schemas.microsoft.com/office/word/2010/wordprocessingShape" mc:Ignorable="w14 w15 w16se w16cid w16 w16cex w16sdtdh w16sdtfl w16du wp14">
   <w:p>
     <w:pPr>
       <w:pBdr>
@@ -55072,7 +55148,7 @@
 </file>
 
 <file path=word/footer2.xml><?xml version="1.0" encoding="utf-8"?>
-<w:ftr xmlns:wpc="http://schemas.microsoft.com/office/word/2010/wordprocessingCanvas" xmlns:cx="http://schemas.microsoft.com/office/drawing/2014/chartex" xmlns:cx1="http://schemas.microsoft.com/office/drawing/2015/9/8/chartex" xmlns:cx2="http://schemas.microsoft.com/office/drawing/2015/10/21/chartex" xmlns:cx3="http://schemas.microsoft.com/office/drawing/2016/5/9/chartex" xmlns:cx4="http://schemas.microsoft.com/office/drawing/2016/5/10/chartex" xmlns:cx5="http://schemas.microsoft.com/office/drawing/2016/5/11/chartex" xmlns:cx6="http://schemas.microsoft.com/office/drawing/2016/5/12/chartex" xmlns:cx7="http://schemas.microsoft.com/office/drawing/2016/5/13/chartex" xmlns:cx8="http://schemas.microsoft.com/office/drawing/2016/5/14/chartex" xmlns:mc="http://schemas.openxmlformats.org/markup-compatibility/2006" xmlns:aink="http://schemas.microsoft.com/office/drawing/2016/ink" xmlns:am3d="http://schemas.microsoft.com/office/drawing/2017/model3d" xmlns:o="urn:schemas-microsoft-com:office:office" xmlns:oel="http://schemas.microsoft.com/office/2019/extlst" xmlns:r="http://schemas.openxmlformats.org/officeDocument/2006/relationships" xmlns:m="http://schemas.openxmlformats.org/officeDocument/2006/math" xmlns:v="urn:schemas-microsoft-com:vml" xmlns:wp14="http://schemas.microsoft.com/office/word/2010/wordprocessingDrawing" xmlns:wp="http://schemas.openxmlformats.org/drawingml/2006/wordprocessingDrawing" xmlns:w10="urn:schemas-microsoft-com:office:word" xmlns:w="http://schemas.openxmlformats.org/wordprocessingml/2006/main" xmlns:w14="http://schemas.microsoft.com/office/word/2010/wordml" xmlns:w15="http://schemas.microsoft.com/office/word/2012/wordml" xmlns:w16cei="http://schemas.microsoft.com/office/word/2026/wordml/cei" xmlns:w16cex="http://schemas.microsoft.com/office/word/2018/wordml/cex" xmlns:w16cid="http://schemas.microsoft.com/office/word/2016/wordml/cid" xmlns:w16="http://schemas.microsoft.com/office/word/2018/wordml" xmlns:w16du="http://schemas.microsoft.com/office/word/2023/wordml/word16du" xmlns:w16sdtdh="http://schemas.microsoft.com/office/word/2020/wordml/sdtdatahash" xmlns:w16sdtfl="http://schemas.microsoft.com/office/word/2024/wordml/sdtformatlock" xmlns:w16se="http://schemas.microsoft.com/office/word/2015/wordml/symex" xmlns:wpg="http://schemas.microsoft.com/office/word/2010/wordprocessingGroup" xmlns:wpi="http://schemas.microsoft.com/office/word/2010/wordprocessingInk" xmlns:wne="http://schemas.microsoft.com/office/word/2006/wordml" xmlns:wps="http://schemas.microsoft.com/office/word/2010/wordprocessingShape" mc:Ignorable="w14 w15 w16se w16cid w16 w16cex w16sdtdh w16sdtfl w16du wp14">
+<w:ftr xmlns:wpc="http://schemas.microsoft.com/office/word/2010/wordprocessingCanvas" xmlns:cx="http://schemas.microsoft.com/office/drawing/2014/chartex" xmlns:cx1="http://schemas.microsoft.com/office/drawing/2015/9/8/chartex" xmlns:cx2="http://schemas.microsoft.com/office/drawing/2015/10/21/chartex" xmlns:cx3="http://schemas.microsoft.com/office/drawing/2016/5/9/chartex" xmlns:cx4="http://schemas.microsoft.com/office/drawing/2016/5/10/chartex" xmlns:cx5="http://schemas.microsoft.com/office/drawing/2016/5/11/chartex" xmlns:cx6="http://schemas.microsoft.com/office/drawing/2016/5/12/chartex" xmlns:cx7="http://schemas.microsoft.com/office/drawing/2016/5/13/chartex" xmlns:cx8="http://schemas.microsoft.com/office/drawing/2016/5/14/chartex" xmlns:mc="http://schemas.openxmlformats.org/markup-compatibility/2006" xmlns:aink="http://schemas.microsoft.com/office/drawing/2016/ink" xmlns:am3d="http://schemas.microsoft.com/office/drawing/2017/model3d" xmlns:o="urn:schemas-microsoft-com:office:office" xmlns:oel="http://schemas.microsoft.com/office/2019/extlst" xmlns:r="http://schemas.openxmlformats.org/officeDocument/2006/relationships" xmlns:m="http://schemas.openxmlformats.org/officeDocument/2006/math" xmlns:v="urn:schemas-microsoft-com:vml" xmlns:wp14="http://schemas.microsoft.com/office/word/2010/wordprocessingDrawing" xmlns:wp="http://schemas.openxmlformats.org/drawingml/2006/wordprocessingDrawing" xmlns:w10="urn:schemas-microsoft-com:office:word" xmlns:w="http://schemas.openxmlformats.org/wordprocessingml/2006/main" xmlns:w14="http://schemas.microsoft.com/office/word/2010/wordml" xmlns:w15="http://schemas.microsoft.com/office/word/2012/wordml" xmlns:w16cex="http://schemas.microsoft.com/office/word/2018/wordml/cex" xmlns:w16cid="http://schemas.microsoft.com/office/word/2016/wordml/cid" xmlns:w16="http://schemas.microsoft.com/office/word/2018/wordml" xmlns:w16du="http://schemas.microsoft.com/office/word/2023/wordml/word16du" xmlns:w16sdtdh="http://schemas.microsoft.com/office/word/2020/wordml/sdtdatahash" xmlns:w16sdtfl="http://schemas.microsoft.com/office/word/2024/wordml/sdtformatlock" xmlns:w16se="http://schemas.microsoft.com/office/word/2015/wordml/symex" xmlns:wpg="http://schemas.microsoft.com/office/word/2010/wordprocessingGroup" xmlns:wpi="http://schemas.microsoft.com/office/word/2010/wordprocessingInk" xmlns:wne="http://schemas.microsoft.com/office/word/2006/wordml" xmlns:wps="http://schemas.microsoft.com/office/word/2010/wordprocessingShape" mc:Ignorable="w14 w15 w16se w16cid w16 w16cex w16sdtdh w16sdtfl w16du wp14">
   <w:p>
     <w:pPr>
       <w:pBdr>
@@ -55292,7 +55368,7 @@
 </file>
 
 <file path=word/footnotes.xml><?xml version="1.0" encoding="utf-8"?>
-<w:footnotes xmlns:wpc="http://schemas.microsoft.com/office/word/2010/wordprocessingCanvas" xmlns:cx="http://schemas.microsoft.com/office/drawing/2014/chartex" xmlns:cx1="http://schemas.microsoft.com/office/drawing/2015/9/8/chartex" xmlns:cx2="http://schemas.microsoft.com/office/drawing/2015/10/21/chartex" xmlns:cx3="http://schemas.microsoft.com/office/drawing/2016/5/9/chartex" xmlns:cx4="http://schemas.microsoft.com/office/drawing/2016/5/10/chartex" xmlns:cx5="http://schemas.microsoft.com/office/drawing/2016/5/11/chartex" xmlns:cx6="http://schemas.microsoft.com/office/drawing/2016/5/12/chartex" xmlns:cx7="http://schemas.microsoft.com/office/drawing/2016/5/13/chartex" xmlns:cx8="http://schemas.microsoft.com/office/drawing/2016/5/14/chartex" xmlns:mc="http://schemas.openxmlformats.org/markup-compatibility/2006" xmlns:aink="http://schemas.microsoft.com/office/drawing/2016/ink" xmlns:am3d="http://schemas.microsoft.com/office/drawing/2017/model3d" xmlns:o="urn:schemas-microsoft-com:office:office" xmlns:oel="http://schemas.microsoft.com/office/2019/extlst" xmlns:r="http://schemas.openxmlformats.org/officeDocument/2006/relationships" xmlns:m="http://schemas.openxmlformats.org/officeDocument/2006/math" xmlns:v="urn:schemas-microsoft-com:vml" xmlns:wp14="http://schemas.microsoft.com/office/word/2010/wordprocessingDrawing" xmlns:wp="http://schemas.openxmlformats.org/drawingml/2006/wordprocessingDrawing" xmlns:w10="urn:schemas-microsoft-com:office:word" xmlns:w="http://schemas.openxmlformats.org/wordprocessingml/2006/main" xmlns:w14="http://schemas.microsoft.com/office/word/2010/wordml" xmlns:w15="http://schemas.microsoft.com/office/word/2012/wordml" xmlns:w16cei="http://schemas.microsoft.com/office/word/2026/wordml/cei" xmlns:w16cex="http://schemas.microsoft.com/office/word/2018/wordml/cex" xmlns:w16cid="http://schemas.microsoft.com/office/word/2016/wordml/cid" xmlns:w16="http://schemas.microsoft.com/office/word/2018/wordml" xmlns:w16du="http://schemas.microsoft.com/office/word/2023/wordml/word16du" xmlns:w16sdtdh="http://schemas.microsoft.com/office/word/2020/wordml/sdtdatahash" xmlns:w16sdtfl="http://schemas.microsoft.com/office/word/2024/wordml/sdtformatlock" xmlns:w16se="http://schemas.microsoft.com/office/word/2015/wordml/symex" xmlns:wpg="http://schemas.microsoft.com/office/word/2010/wordprocessingGroup" xmlns:wpi="http://schemas.microsoft.com/office/word/2010/wordprocessingInk" xmlns:wne="http://schemas.microsoft.com/office/word/2006/wordml" xmlns:wps="http://schemas.microsoft.com/office/word/2010/wordprocessingShape" mc:Ignorable="w14 w15 w16se w16cid w16 w16cex w16sdtdh w16sdtfl w16du wp14">
+<w:footnotes xmlns:wpc="http://schemas.microsoft.com/office/word/2010/wordprocessingCanvas" xmlns:cx="http://schemas.microsoft.com/office/drawing/2014/chartex" xmlns:cx1="http://schemas.microsoft.com/office/drawing/2015/9/8/chartex" xmlns:cx2="http://schemas.microsoft.com/office/drawing/2015/10/21/chartex" xmlns:cx3="http://schemas.microsoft.com/office/drawing/2016/5/9/chartex" xmlns:cx4="http://schemas.microsoft.com/office/drawing/2016/5/10/chartex" xmlns:cx5="http://schemas.microsoft.com/office/drawing/2016/5/11/chartex" xmlns:cx6="http://schemas.microsoft.com/office/drawing/2016/5/12/chartex" xmlns:cx7="http://schemas.microsoft.com/office/drawing/2016/5/13/chartex" xmlns:cx8="http://schemas.microsoft.com/office/drawing/2016/5/14/chartex" xmlns:mc="http://schemas.openxmlformats.org/markup-compatibility/2006" xmlns:aink="http://schemas.microsoft.com/office/drawing/2016/ink" xmlns:am3d="http://schemas.microsoft.com/office/drawing/2017/model3d" xmlns:o="urn:schemas-microsoft-com:office:office" xmlns:oel="http://schemas.microsoft.com/office/2019/extlst" xmlns:r="http://schemas.openxmlformats.org/officeDocument/2006/relationships" xmlns:m="http://schemas.openxmlformats.org/officeDocument/2006/math" xmlns:v="urn:schemas-microsoft-com:vml" xmlns:wp14="http://schemas.microsoft.com/office/word/2010/wordprocessingDrawing" xmlns:wp="http://schemas.openxmlformats.org/drawingml/2006/wordprocessingDrawing" xmlns:w10="urn:schemas-microsoft-com:office:word" xmlns:w="http://schemas.openxmlformats.org/wordprocessingml/2006/main" xmlns:w14="http://schemas.microsoft.com/office/word/2010/wordml" xmlns:w15="http://schemas.microsoft.com/office/word/2012/wordml" xmlns:w16cex="http://schemas.microsoft.com/office/word/2018/wordml/cex" xmlns:w16cid="http://schemas.microsoft.com/office/word/2016/wordml/cid" xmlns:w16="http://schemas.microsoft.com/office/word/2018/wordml" xmlns:w16du="http://schemas.microsoft.com/office/word/2023/wordml/word16du" xmlns:w16sdtdh="http://schemas.microsoft.com/office/word/2020/wordml/sdtdatahash" xmlns:w16sdtfl="http://schemas.microsoft.com/office/word/2024/wordml/sdtformatlock" xmlns:w16se="http://schemas.microsoft.com/office/word/2015/wordml/symex" xmlns:wpg="http://schemas.microsoft.com/office/word/2010/wordprocessingGroup" xmlns:wpi="http://schemas.microsoft.com/office/word/2010/wordprocessingInk" xmlns:wne="http://schemas.microsoft.com/office/word/2006/wordml" xmlns:wps="http://schemas.microsoft.com/office/word/2010/wordprocessingShape" mc:Ignorable="w14 w15 w16se w16cid w16 w16cex w16sdtdh w16sdtfl w16du wp14">
   <w:footnote w:type="separator" w:id="-1">
     <w:p>
       <w:pPr>
@@ -55317,7 +55393,7 @@
 </file>
 
 <file path=word/header1.xml><?xml version="1.0" encoding="utf-8"?>
-<w:hdr xmlns:wpc="http://schemas.microsoft.com/office/word/2010/wordprocessingCanvas" xmlns:cx="http://schemas.microsoft.com/office/drawing/2014/chartex" xmlns:cx1="http://schemas.microsoft.com/office/drawing/2015/9/8/chartex" xmlns:cx2="http://schemas.microsoft.com/office/drawing/2015/10/21/chartex" xmlns:cx3="http://schemas.microsoft.com/office/drawing/2016/5/9/chartex" xmlns:cx4="http://schemas.microsoft.com/office/drawing/2016/5/10/chartex" xmlns:cx5="http://schemas.microsoft.com/office/drawing/2016/5/11/chartex" xmlns:cx6="http://schemas.microsoft.com/office/drawing/2016/5/12/chartex" xmlns:cx7="http://schemas.microsoft.com/office/drawing/2016/5/13/chartex" xmlns:cx8="http://schemas.microsoft.com/office/drawing/2016/5/14/chartex" xmlns:mc="http://schemas.openxmlformats.org/markup-compatibility/2006" xmlns:aink="http://schemas.microsoft.com/office/drawing/2016/ink" xmlns:am3d="http://schemas.microsoft.com/office/drawing/2017/model3d" xmlns:o="urn:schemas-microsoft-com:office:office" xmlns:oel="http://schemas.microsoft.com/office/2019/extlst" xmlns:r="http://schemas.openxmlformats.org/officeDocument/2006/relationships" xmlns:m="http://schemas.openxmlformats.org/officeDocument/2006/math" xmlns:v="urn:schemas-microsoft-com:vml" xmlns:wp14="http://schemas.microsoft.com/office/word/2010/wordprocessingDrawing" xmlns:wp="http://schemas.openxmlformats.org/drawingml/2006/wordprocessingDrawing" xmlns:w10="urn:schemas-microsoft-com:office:word" xmlns:w="http://schemas.openxmlformats.org/wordprocessingml/2006/main" xmlns:w14="http://schemas.microsoft.com/office/word/2010/wordml" xmlns:w15="http://schemas.microsoft.com/office/word/2012/wordml" xmlns:w16cei="http://schemas.microsoft.com/office/word/2026/wordml/cei" xmlns:w16cex="http://schemas.microsoft.com/office/word/2018/wordml/cex" xmlns:w16cid="http://schemas.microsoft.com/office/word/2016/wordml/cid" xmlns:w16="http://schemas.microsoft.com/office/word/2018/wordml" xmlns:w16du="http://schemas.microsoft.com/office/word/2023/wordml/word16du" xmlns:w16sdtdh="http://schemas.microsoft.com/office/word/2020/wordml/sdtdatahash" xmlns:w16sdtfl="http://schemas.microsoft.com/office/word/2024/wordml/sdtformatlock" xmlns:w16se="http://schemas.microsoft.com/office/word/2015/wordml/symex" xmlns:wpg="http://schemas.microsoft.com/office/word/2010/wordprocessingGroup" xmlns:wpi="http://schemas.microsoft.com/office/word/2010/wordprocessingInk" xmlns:wne="http://schemas.microsoft.com/office/word/2006/wordml" xmlns:wps="http://schemas.microsoft.com/office/word/2010/wordprocessingShape" mc:Ignorable="w14 w15 w16se w16cid w16 w16cex w16sdtdh w16sdtfl w16du wp14">
+<w:hdr xmlns:wpc="http://schemas.microsoft.com/office/word/2010/wordprocessingCanvas" xmlns:cx="http://schemas.microsoft.com/office/drawing/2014/chartex" xmlns:cx1="http://schemas.microsoft.com/office/drawing/2015/9/8/chartex" xmlns:cx2="http://schemas.microsoft.com/office/drawing/2015/10/21/chartex" xmlns:cx3="http://schemas.microsoft.com/office/drawing/2016/5/9/chartex" xmlns:cx4="http://schemas.microsoft.com/office/drawing/2016/5/10/chartex" xmlns:cx5="http://schemas.microsoft.com/office/drawing/2016/5/11/chartex" xmlns:cx6="http://schemas.microsoft.com/office/drawing/2016/5/12/chartex" xmlns:cx7="http://schemas.microsoft.com/office/drawing/2016/5/13/chartex" xmlns:cx8="http://schemas.microsoft.com/office/drawing/2016/5/14/chartex" xmlns:mc="http://schemas.openxmlformats.org/markup-compatibility/2006" xmlns:aink="http://schemas.microsoft.com/office/drawing/2016/ink" xmlns:am3d="http://schemas.microsoft.com/office/drawing/2017/model3d" xmlns:o="urn:schemas-microsoft-com:office:office" xmlns:oel="http://schemas.microsoft.com/office/2019/extlst" xmlns:r="http://schemas.openxmlformats.org/officeDocument/2006/relationships" xmlns:m="http://schemas.openxmlformats.org/officeDocument/2006/math" xmlns:v="urn:schemas-microsoft-com:vml" xmlns:wp14="http://schemas.microsoft.com/office/word/2010/wordprocessingDrawing" xmlns:wp="http://schemas.openxmlformats.org/drawingml/2006/wordprocessingDrawing" xmlns:w10="urn:schemas-microsoft-com:office:word" xmlns:w="http://schemas.openxmlformats.org/wordprocessingml/2006/main" xmlns:w14="http://schemas.microsoft.com/office/word/2010/wordml" xmlns:w15="http://schemas.microsoft.com/office/word/2012/wordml" xmlns:w16cex="http://schemas.microsoft.com/office/word/2018/wordml/cex" xmlns:w16cid="http://schemas.microsoft.com/office/word/2016/wordml/cid" xmlns:w16="http://schemas.microsoft.com/office/word/2018/wordml" xmlns:w16du="http://schemas.microsoft.com/office/word/2023/wordml/word16du" xmlns:w16sdtdh="http://schemas.microsoft.com/office/word/2020/wordml/sdtdatahash" xmlns:w16sdtfl="http://schemas.microsoft.com/office/word/2024/wordml/sdtformatlock" xmlns:w16se="http://schemas.microsoft.com/office/word/2015/wordml/symex" xmlns:wpg="http://schemas.microsoft.com/office/word/2010/wordprocessingGroup" xmlns:wpi="http://schemas.microsoft.com/office/word/2010/wordprocessingInk" xmlns:wne="http://schemas.microsoft.com/office/word/2006/wordml" xmlns:wps="http://schemas.microsoft.com/office/word/2010/wordprocessingShape" mc:Ignorable="w14 w15 w16se w16cid w16 w16cex w16sdtdh w16sdtfl w16du wp14">
   <w:p>
     <w:pPr>
       <w:pStyle w:val="Header"/>
@@ -55338,7 +55414,7 @@
 </file>
 
 <file path=word/header2.xml><?xml version="1.0" encoding="utf-8"?>
-<w:hdr xmlns:wpc="http://schemas.microsoft.com/office/word/2010/wordprocessingCanvas" xmlns:cx="http://schemas.microsoft.com/office/drawing/2014/chartex" xmlns:cx1="http://schemas.microsoft.com/office/drawing/2015/9/8/chartex" xmlns:cx2="http://schemas.microsoft.com/office/drawing/2015/10/21/chartex" xmlns:cx3="http://schemas.microsoft.com/office/drawing/2016/5/9/chartex" xmlns:cx4="http://schemas.microsoft.com/office/drawing/2016/5/10/chartex" xmlns:cx5="http://schemas.microsoft.com/office/drawing/2016/5/11/chartex" xmlns:cx6="http://schemas.microsoft.com/office/drawing/2016/5/12/chartex" xmlns:cx7="http://schemas.microsoft.com/office/drawing/2016/5/13/chartex" xmlns:cx8="http://schemas.microsoft.com/office/drawing/2016/5/14/chartex" xmlns:mc="http://schemas.openxmlformats.org/markup-compatibility/2006" xmlns:aink="http://schemas.microsoft.com/office/drawing/2016/ink" xmlns:am3d="http://schemas.microsoft.com/office/drawing/2017/model3d" xmlns:o="urn:schemas-microsoft-com:office:office" xmlns:oel="http://schemas.microsoft.com/office/2019/extlst" xmlns:r="http://schemas.openxmlformats.org/officeDocument/2006/relationships" xmlns:m="http://schemas.openxmlformats.org/officeDocument/2006/math" xmlns:v="urn:schemas-microsoft-com:vml" xmlns:wp14="http://schemas.microsoft.com/office/word/2010/wordprocessingDrawing" xmlns:wp="http://schemas.openxmlformats.org/drawingml/2006/wordprocessingDrawing" xmlns:w10="urn:schemas-microsoft-com:office:word" xmlns:w="http://schemas.openxmlformats.org/wordprocessingml/2006/main" xmlns:w14="http://schemas.microsoft.com/office/word/2010/wordml" xmlns:w15="http://schemas.microsoft.com/office/word/2012/wordml" xmlns:w16cei="http://schemas.microsoft.com/office/word/2026/wordml/cei" xmlns:w16cex="http://schemas.microsoft.com/office/word/2018/wordml/cex" xmlns:w16cid="http://schemas.microsoft.com/office/word/2016/wordml/cid" xmlns:w16="http://schemas.microsoft.com/office/word/2018/wordml" xmlns:w16du="http://schemas.microsoft.com/office/word/2023/wordml/word16du" xmlns:w16sdtdh="http://schemas.microsoft.com/office/word/2020/wordml/sdtdatahash" xmlns:w16sdtfl="http://schemas.microsoft.com/office/word/2024/wordml/sdtformatlock" xmlns:w16se="http://schemas.microsoft.com/office/word/2015/wordml/symex" xmlns:wpg="http://schemas.microsoft.com/office/word/2010/wordprocessingGroup" xmlns:wpi="http://schemas.microsoft.com/office/word/2010/wordprocessingInk" xmlns:wne="http://schemas.microsoft.com/office/word/2006/wordml" xmlns:wps="http://schemas.microsoft.com/office/word/2010/wordprocessingShape" mc:Ignorable="w14 w15 w16se w16cid w16 w16cex w16sdtdh w16sdtfl w16du wp14">
+<w:hdr xmlns:wpc="http://schemas.microsoft.com/office/word/2010/wordprocessingCanvas" xmlns:cx="http://schemas.microsoft.com/office/drawing/2014/chartex" xmlns:cx1="http://schemas.microsoft.com/office/drawing/2015/9/8/chartex" xmlns:cx2="http://schemas.microsoft.com/office/drawing/2015/10/21/chartex" xmlns:cx3="http://schemas.microsoft.com/office/drawing/2016/5/9/chartex" xmlns:cx4="http://schemas.microsoft.com/office/drawing/2016/5/10/chartex" xmlns:cx5="http://schemas.microsoft.com/office/drawing/2016/5/11/chartex" xmlns:cx6="http://schemas.microsoft.com/office/drawing/2016/5/12/chartex" xmlns:cx7="http://schemas.microsoft.com/office/drawing/2016/5/13/chartex" xmlns:cx8="http://schemas.microsoft.com/office/drawing/2016/5/14/chartex" xmlns:mc="http://schemas.openxmlformats.org/markup-compatibility/2006" xmlns:aink="http://schemas.microsoft.com/office/drawing/2016/ink" xmlns:am3d="http://schemas.microsoft.com/office/drawing/2017/model3d" xmlns:o="urn:schemas-microsoft-com:office:office" xmlns:oel="http://schemas.microsoft.com/office/2019/extlst" xmlns:r="http://schemas.openxmlformats.org/officeDocument/2006/relationships" xmlns:m="http://schemas.openxmlformats.org/officeDocument/2006/math" xmlns:v="urn:schemas-microsoft-com:vml" xmlns:wp14="http://schemas.microsoft.com/office/word/2010/wordprocessingDrawing" xmlns:wp="http://schemas.openxmlformats.org/drawingml/2006/wordprocessingDrawing" xmlns:w10="urn:schemas-microsoft-com:office:word" xmlns:w="http://schemas.openxmlformats.org/wordprocessingml/2006/main" xmlns:w14="http://schemas.microsoft.com/office/word/2010/wordml" xmlns:w15="http://schemas.microsoft.com/office/word/2012/wordml" xmlns:w16cex="http://schemas.microsoft.com/office/word/2018/wordml/cex" xmlns:w16cid="http://schemas.microsoft.com/office/word/2016/wordml/cid" xmlns:w16="http://schemas.microsoft.com/office/word/2018/wordml" xmlns:w16du="http://schemas.microsoft.com/office/word/2023/wordml/word16du" xmlns:w16sdtdh="http://schemas.microsoft.com/office/word/2020/wordml/sdtdatahash" xmlns:w16sdtfl="http://schemas.microsoft.com/office/word/2024/wordml/sdtformatlock" xmlns:w16se="http://schemas.microsoft.com/office/word/2015/wordml/symex" xmlns:wpg="http://schemas.microsoft.com/office/word/2010/wordprocessingGroup" xmlns:wpi="http://schemas.microsoft.com/office/word/2010/wordprocessingInk" xmlns:wne="http://schemas.microsoft.com/office/word/2006/wordml" xmlns:wps="http://schemas.microsoft.com/office/word/2010/wordprocessingShape" mc:Ignorable="w14 w15 w16se w16cid w16 w16cex w16sdtdh w16sdtfl w16du wp14">
   <w:p>
     <w:pPr>
       <w:pStyle w:val="Header"/>

</xml_diff>